<commit_message>
Update detailed description with subnumbering and include new ChatGPT images
</commit_message>
<xml_diff>
--- a/Professional_Patent_Draft_v2.docx
+++ b/Professional_Patent_Draft_v2.docx
@@ -242,7 +242,7 @@
         <w:jc w:val="both"/>
       </w:pPr>
       <w:r>
-        <w:t>[0018] Referring to FIG. 3, the multi-target physiological monitoring system 100 comprises a Data Acquisition Layer 110 having a sensor array 102 configured for placement in proximity to the subjects. In a preferred embodiment, the sensor array 102 comprises at least two high-sensitivity strain gauges 104, piezoelectric strips, or hydraulic sensors disposed beneath a mattress. An analog-to-digital converter (ADC) 106 samples the signals at a high frequency (e.g., 100 Hz). The raw data is continuously buffered into overlapping or non-overlapping temporal windows (e.g., 10-second intervals) for batch processing within a buffer 112.</w:t>
+        <w:t>[0018] Referring to FIG. 3, the multi-target physiological monitoring system 100 comprises a Data Acquisition Layer 110 having a sensor array 102 configured for placement in proximity to the subjects, for example a first subject 150a and a second subject 150b. In a preferred embodiment, the sensor array 102 comprises at least a first high-sensitivity strain gauge 104a and a second high-sensitivity strain gauge 104b, piezoelectric strips, or hydraulic sensors disposed beneath a mattress. A first analog-to-digital converter (ADC) 106a and a second analog-to-digital converter (ADC) 106b sample the signals at a high frequency (e.g., 100 Hz). The raw data is continuously buffered into overlapping or non-overlapping temporal windows (e.g., 10-second intervals) for batch processing within a buffer 112.</w:t>
       </w:r>
     </w:p>
     <w:p>
@@ -261,7 +261,7 @@
         <w:jc w:val="both"/>
       </w:pPr>
       <w:r>
-        <w:t>[0019] As shown in FIGS. 4 and 5, the buffered mixed signals are passed to the Source Recovery Engine 200. First, a bandpass filter 202 isolates specific frequency bands of physiological interest, such as 0.8 Hz to 3.0 Hz for human heart rate. Following filtration, the Source Recovery Engine 200 executes a Blind Source Separation (BSS) algorithm 204. Unlike time-delay methodologies of the prior art, the BSS algorithm 204 mathematically decomposes the mixed multi-channel signal into a set of maximally independent latent source components. In a preferred embodiment, FastICA (Fast Independent Component Analysis) is utilized to generate a set of continuous, disentangled waveforms corresponding to the individual physiological rhythms (e.g., ballistocardiogram signatures) of each occupant.</w:t>
+        <w:t>[0019] As shown in FIGS. 4 and 5, the buffered mixed signals from the first sensor 104a and the second sensor 104b are passed to the Source Recovery Engine 200. First, a bandpass filter 202 isolates specific frequency bands of physiological interest, such as 0.8 Hz to 3.0 Hz for human heart rate. Following filtration, the Source Recovery Engine 200 executes a Blind Source Separation (BSS) algorithm 204. Unlike time-delay methodologies of the prior art, the BSS algorithm 204 mathematically decomposes the mixed multi-channel signal into a set of maximally independent latent source components, for example a first latent source stream 206a and a second latent source stream 206b. In a preferred embodiment, FastICA (Fast Independent Component Analysis) is utilized to generate a set of continuous, disentangled waveforms corresponding to the individual physiological rhythms (e.g., ballistocardiogram signatures) of each occupant, such as a first physiological rhythm 208a corresponding to the first subject 150a, and a second physiological rhythm 208b corresponding to the second subject 150b.</w:t>
       </w:r>
     </w:p>
     <w:p>
@@ -280,7 +280,7 @@
         <w:jc w:val="both"/>
       </w:pPr>
       <w:r>
-        <w:t>[0020] Referring to FIG. 6, because BSS algorithms inherently suffer from permutation ambiguity (the order of the output sources is random), the Occupant Attribution Engine 300 must resolve which latent source corresponds to which physical occupant. The Occupant Attribution Engine 300 calculates a spatial fingerprint 302 for each latent source by determining its cross-correlation with the raw, unfiltered signals originating from specific physical locations (e.g., Left Sensor vs. Right Sensor). By fusing spatial correlation, signal energy, and historical baseline metrics, the Occupant Attribution Engine 300 formulates a probabilistic assignment matrix 304. The difference between the highest and second-highest assignment probabilities is mapped to an Attribution Confidence Score 306.</w:t>
+        <w:t>[0020] Referring to FIG. 6, because BSS algorithms inherently suffer from permutation ambiguity (the order of the output sources is random), the Occupant Attribution Engine 300 must resolve which latent source 206a, 206b corresponds to which physical occupant 150a, 150b. The Occupant Attribution Engine 300 calculates a first spatial fingerprint 302a for the first latent source 206a and a second spatial fingerprint 302b for the second latent source 206b by determining its cross-correlation with the raw, unfiltered signals originating from specific physical locations (e.g., Left Sensor 104a vs. Right Sensor 104b). By fusing spatial correlation, signal energy, and historical baseline metrics, the Occupant Attribution Engine 300 formulates a probabilistic assignment matrix 304. The difference between the highest and second-highest assignment probabilities is mapped to an Attribution Confidence Score 306.</w:t>
       </w:r>
     </w:p>
     <w:p>
@@ -299,7 +299,7 @@
         <w:jc w:val="both"/>
       </w:pPr>
       <w:r>
-        <w:t>[0021] As illustrated in FIG. 7 and FIG. 8, continuous physiological monitoring is highly susceptible to momentary artifacts. The Identity Persistence Engine 400 prevents transient assignment errors from corrupting longitudinal sleep metrics. The Identity Persistence Engine 400 maintains a running memory of the active identity mapping 402 via a state machine 404. If the Occupant Attribution Engine 300 proposes a mapping that contradicts the active identity mapping 402 (e.g., suggesting Subject A is now on the Right Sensor), the Identity Persistence Engine 400 evaluates the Attribution Confidence Score 306 against a pre-configured swap-threshold (e.g., 80% confidence). If the threshold is not met, the proposed swap is rejected as noise, and the active identity mapping 402 is persisted. If the threshold is exceeded, the swap is approved, accommodating legitimate physical crossover events without losing the continuous physiological thread of either subject.</w:t>
+        <w:t>[0021] As illustrated in FIG. 7 and FIG. 8, continuous physiological monitoring is highly susceptible to momentary artifacts. The Identity Persistence Engine 400 prevents transient assignment errors from corrupting longitudinal sleep metrics. The Identity Persistence Engine 400 maintains a running memory of the active identity mapping 402 via a state machine 404. If the Occupant Attribution Engine 300 proposes a mapping that contradicts the active identity mapping 402 (e.g., suggesting first subject 150a is now on the second sensor 104b), the Identity Persistence Engine 400 evaluates the Attribution Confidence Score 306 against a pre-configured swap-threshold (e.g., 80% confidence). If the threshold is not met, the proposed swap is rejected as noise, and the active identity mapping 402 is persisted. If the threshold is exceeded, the swap is approved, accommodating legitimate physical crossover events without losing the continuous physiological thread of either subject 150a, 150b.</w:t>
       </w:r>
     </w:p>
     <w:p>
@@ -471,7 +471,7 @@
       <w:r>
         <w:drawing>
           <wp:inline xmlns:a="http://schemas.openxmlformats.org/drawingml/2006/main" xmlns:pic="http://schemas.openxmlformats.org/drawingml/2006/picture">
-            <wp:extent cx="1991973" cy="3200400"/>
+            <wp:extent cx="1931773" cy="3200400"/>
             <wp:docPr id="1" name="Picture 1"/>
             <wp:cNvGraphicFramePr>
               <a:graphicFrameLocks noChangeAspect="1"/>
@@ -480,7 +480,7 @@
               <a:graphicData uri="http://schemas.openxmlformats.org/drawingml/2006/picture">
                 <pic:pic>
                   <pic:nvPicPr>
-                    <pic:cNvPr id="0" name="Technical diagram of heart signal processing.png"/>
+                    <pic:cNvPr id="0" name="ChatGPT Image Jul 22, 2026, 06_18_41 AM.png"/>
                     <pic:cNvPicPr/>
                   </pic:nvPicPr>
                   <pic:blipFill>
@@ -492,7 +492,7 @@
                   <pic:spPr>
                     <a:xfrm>
                       <a:off x="0" y="0"/>
-                      <a:ext cx="1991973" cy="3200400"/>
+                      <a:ext cx="1931773" cy="3200400"/>
                     </a:xfrm>
                     <a:prstGeom prst="rect"/>
                   </pic:spPr>
@@ -516,7 +516,7 @@
       <w:r>
         <w:drawing>
           <wp:inline xmlns:a="http://schemas.openxmlformats.org/drawingml/2006/main" xmlns:pic="http://schemas.openxmlformats.org/drawingml/2006/picture">
-            <wp:extent cx="2195688" cy="3200400"/>
+            <wp:extent cx="2198836" cy="3200400"/>
             <wp:docPr id="2" name="Picture 2"/>
             <wp:cNvGraphicFramePr>
               <a:graphicFrameLocks noChangeAspect="1"/>
@@ -525,7 +525,7 @@
               <a:graphicData uri="http://schemas.openxmlformats.org/drawingml/2006/picture">
                 <pic:pic>
                   <pic:nvPicPr>
-                    <pic:cNvPr id="0" name="Technical diagram of heart signal processing2.png"/>
+                    <pic:cNvPr id="0" name="ChatGPT Image Jul 22, 2026, 06_18_41 AM1.png"/>
                     <pic:cNvPicPr/>
                   </pic:nvPicPr>
                   <pic:blipFill>
@@ -537,7 +537,7 @@
                   <pic:spPr>
                     <a:xfrm>
                       <a:off x="0" y="0"/>
-                      <a:ext cx="2195688" cy="3200400"/>
+                      <a:ext cx="2198836" cy="3200400"/>
                     </a:xfrm>
                     <a:prstGeom prst="rect"/>
                   </pic:spPr>
@@ -566,7 +566,7 @@
       <w:r>
         <w:drawing>
           <wp:inline xmlns:a="http://schemas.openxmlformats.org/drawingml/2006/main" xmlns:pic="http://schemas.openxmlformats.org/drawingml/2006/picture">
-            <wp:extent cx="2081651" cy="3200400"/>
+            <wp:extent cx="2202110" cy="3200400"/>
             <wp:docPr id="3" name="Picture 3"/>
             <wp:cNvGraphicFramePr>
               <a:graphicFrameLocks noChangeAspect="1"/>
@@ -575,7 +575,7 @@
               <a:graphicData uri="http://schemas.openxmlformats.org/drawingml/2006/picture">
                 <pic:pic>
                   <pic:nvPicPr>
-                    <pic:cNvPr id="0" name="Technical diagram of heart signal processing3.png"/>
+                    <pic:cNvPr id="0" name="ChatGPT Image Jul 22, 2026, 06_18_41 AM2.png"/>
                     <pic:cNvPicPr/>
                   </pic:nvPicPr>
                   <pic:blipFill>
@@ -587,7 +587,7 @@
                   <pic:spPr>
                     <a:xfrm>
                       <a:off x="0" y="0"/>
-                      <a:ext cx="2081651" cy="3200400"/>
+                      <a:ext cx="2202110" cy="3200400"/>
                     </a:xfrm>
                     <a:prstGeom prst="rect"/>
                   </pic:spPr>
@@ -611,7 +611,7 @@
       <w:r>
         <w:drawing>
           <wp:inline xmlns:a="http://schemas.openxmlformats.org/drawingml/2006/main" xmlns:pic="http://schemas.openxmlformats.org/drawingml/2006/picture">
-            <wp:extent cx="2118809" cy="3200400"/>
+            <wp:extent cx="2046157" cy="3200400"/>
             <wp:docPr id="4" name="Picture 4"/>
             <wp:cNvGraphicFramePr>
               <a:graphicFrameLocks noChangeAspect="1"/>
@@ -620,7 +620,7 @@
               <a:graphicData uri="http://schemas.openxmlformats.org/drawingml/2006/picture">
                 <pic:pic>
                   <pic:nvPicPr>
-                    <pic:cNvPr id="0" name="Technical diagram of heart signal processing4.png"/>
+                    <pic:cNvPr id="0" name="ChatGPT Image Jul 22, 2026, 06_18_41 AM3.png"/>
                     <pic:cNvPicPr/>
                   </pic:nvPicPr>
                   <pic:blipFill>
@@ -632,7 +632,7 @@
                   <pic:spPr>
                     <a:xfrm>
                       <a:off x="0" y="0"/>
-                      <a:ext cx="2118809" cy="3200400"/>
+                      <a:ext cx="2046157" cy="3200400"/>
                     </a:xfrm>
                     <a:prstGeom prst="rect"/>
                   </pic:spPr>
@@ -661,7 +661,7 @@
       <w:r>
         <w:drawing>
           <wp:inline xmlns:a="http://schemas.openxmlformats.org/drawingml/2006/main" xmlns:pic="http://schemas.openxmlformats.org/drawingml/2006/picture">
-            <wp:extent cx="3007783" cy="3200400"/>
+            <wp:extent cx="3069298" cy="3200400"/>
             <wp:docPr id="5" name="Picture 5"/>
             <wp:cNvGraphicFramePr>
               <a:graphicFrameLocks noChangeAspect="1"/>
@@ -670,7 +670,7 @@
               <a:graphicData uri="http://schemas.openxmlformats.org/drawingml/2006/picture">
                 <pic:pic>
                   <pic:nvPicPr>
-                    <pic:cNvPr id="0" name="Technical diagram of heart signal processing5.png"/>
+                    <pic:cNvPr id="0" name="ChatGPT Image Jul 22, 2026, 06_18_41 AM4.png"/>
                     <pic:cNvPicPr/>
                   </pic:nvPicPr>
                   <pic:blipFill>
@@ -682,7 +682,7 @@
                   <pic:spPr>
                     <a:xfrm>
                       <a:off x="0" y="0"/>
-                      <a:ext cx="3007783" cy="3200400"/>
+                      <a:ext cx="3069298" cy="3200400"/>
                     </a:xfrm>
                     <a:prstGeom prst="rect"/>
                   </pic:spPr>
@@ -706,7 +706,7 @@
       <w:r>
         <w:drawing>
           <wp:inline xmlns:a="http://schemas.openxmlformats.org/drawingml/2006/main" xmlns:pic="http://schemas.openxmlformats.org/drawingml/2006/picture">
-            <wp:extent cx="2533650" cy="3200400"/>
+            <wp:extent cx="2598263" cy="3200400"/>
             <wp:docPr id="6" name="Picture 6"/>
             <wp:cNvGraphicFramePr>
               <a:graphicFrameLocks noChangeAspect="1"/>
@@ -715,7 +715,7 @@
               <a:graphicData uri="http://schemas.openxmlformats.org/drawingml/2006/picture">
                 <pic:pic>
                   <pic:nvPicPr>
-                    <pic:cNvPr id="0" name="Technical diagram of heart signal processing6.png"/>
+                    <pic:cNvPr id="0" name="ChatGPT Image Jul 22, 2026, 06_18_41 AM5.png"/>
                     <pic:cNvPicPr/>
                   </pic:nvPicPr>
                   <pic:blipFill>
@@ -727,7 +727,7 @@
                   <pic:spPr>
                     <a:xfrm>
                       <a:off x="0" y="0"/>
-                      <a:ext cx="2533650" cy="3200400"/>
+                      <a:ext cx="2598263" cy="3200400"/>
                     </a:xfrm>
                     <a:prstGeom prst="rect"/>
                   </pic:spPr>
@@ -756,7 +756,7 @@
       <w:r>
         <w:drawing>
           <wp:inline xmlns:a="http://schemas.openxmlformats.org/drawingml/2006/main" xmlns:pic="http://schemas.openxmlformats.org/drawingml/2006/picture">
-            <wp:extent cx="2793883" cy="3200400"/>
+            <wp:extent cx="2948940" cy="3200400"/>
             <wp:docPr id="7" name="Picture 7"/>
             <wp:cNvGraphicFramePr>
               <a:graphicFrameLocks noChangeAspect="1"/>
@@ -765,7 +765,7 @@
               <a:graphicData uri="http://schemas.openxmlformats.org/drawingml/2006/picture">
                 <pic:pic>
                   <pic:nvPicPr>
-                    <pic:cNvPr id="0" name="Technical diagram of heart signal processing7.png"/>
+                    <pic:cNvPr id="0" name="ChatGPT Image Jul 22, 2026, 06_18_41 AM6.png"/>
                     <pic:cNvPicPr/>
                   </pic:nvPicPr>
                   <pic:blipFill>
@@ -777,7 +777,7 @@
                   <pic:spPr>
                     <a:xfrm>
                       <a:off x="0" y="0"/>
-                      <a:ext cx="2793883" cy="3200400"/>
+                      <a:ext cx="2948940" cy="3200400"/>
                     </a:xfrm>
                     <a:prstGeom prst="rect"/>
                   </pic:spPr>
@@ -801,7 +801,7 @@
       <w:r>
         <w:drawing>
           <wp:inline xmlns:a="http://schemas.openxmlformats.org/drawingml/2006/main" xmlns:pic="http://schemas.openxmlformats.org/drawingml/2006/picture">
-            <wp:extent cx="2764318" cy="3200400"/>
+            <wp:extent cx="2505004" cy="3200400"/>
             <wp:docPr id="8" name="Picture 8"/>
             <wp:cNvGraphicFramePr>
               <a:graphicFrameLocks noChangeAspect="1"/>
@@ -810,7 +810,7 @@
               <a:graphicData uri="http://schemas.openxmlformats.org/drawingml/2006/picture">
                 <pic:pic>
                   <pic:nvPicPr>
-                    <pic:cNvPr id="0" name="Technical diagram of heart signal processing8.png"/>
+                    <pic:cNvPr id="0" name="ChatGPT Image Jul 22, 2026, 06_18_41 AM7.png"/>
                     <pic:cNvPicPr/>
                   </pic:nvPicPr>
                   <pic:blipFill>
@@ -822,7 +822,7 @@
                   <pic:spPr>
                     <a:xfrm>
                       <a:off x="0" y="0"/>
-                      <a:ext cx="2764318" cy="3200400"/>
+                      <a:ext cx="2505004" cy="3200400"/>
                     </a:xfrm>
                     <a:prstGeom prst="rect"/>
                   </pic:spPr>

</xml_diff>

<commit_message>
Update v2 doc with image numbering based on detailed description text
</commit_message>
<xml_diff>
--- a/Professional_Patent_Draft_v2.docx
+++ b/Professional_Patent_Draft_v2.docx
@@ -242,7 +242,7 @@
         <w:jc w:val="both"/>
       </w:pPr>
       <w:r>
-        <w:t>[0018] Referring to FIG. 3, the multi-target physiological monitoring system 100 comprises a Data Acquisition Layer 110 having a sensor array 102 configured for placement in proximity to the subjects, for example a first subject 150a and a second subject 150b. In a preferred embodiment, the sensor array 102 comprises at least a first high-sensitivity strain gauge 104a and a second high-sensitivity strain gauge 104b, piezoelectric strips, or hydraulic sensors disposed beneath a mattress. A first analog-to-digital converter (ADC) 106a and a second analog-to-digital converter (ADC) 106b sample the signals at a high frequency (e.g., 100 Hz). The raw data is continuously buffered into overlapping or non-overlapping temporal windows (e.g., 10-second intervals) for batch processing within a buffer 112.</w:t>
+        <w:t>[0018] Referring to FIG. 1 and FIG. 2, the multi-target physiological monitoring system 100 comprises a sensor array 101 configured for placement in proximity to the subjects, for example PERSON A and PERSON B. In a preferred embodiment, the sensor array 101 comprises at least a first sensor 201 (S1), a second sensor 202 (S2), and optionally a third sensor 203 (S3) disposed beneath a mattress. The signals from the sensor array 101 undergo analog signal conditioning 102. An analog-to-digital converter (ADC) 103 samples the signals at a high frequency. The raw data is continuously buffered and passed to a processing unit 104.</w:t>
       </w:r>
     </w:p>
     <w:p>
@@ -261,7 +261,7 @@
         <w:jc w:val="both"/>
       </w:pPr>
       <w:r>
-        <w:t>[0019] As shown in FIGS. 4 and 5, the buffered mixed signals from the first sensor 104a and the second sensor 104b are passed to the Source Recovery Engine 200. First, a bandpass filter 202 isolates specific frequency bands of physiological interest, such as 0.8 Hz to 3.0 Hz for human heart rate. Following filtration, the Source Recovery Engine 200 executes a Blind Source Separation (BSS) algorithm 204. Unlike time-delay methodologies of the prior art, the BSS algorithm 204 mathematically decomposes the mixed multi-channel signal into a set of maximally independent latent source components, for example a first latent source stream 206a and a second latent source stream 206b. In a preferred embodiment, FastICA (Fast Independent Component Analysis) is utilized to generate a set of continuous, disentangled waveforms corresponding to the individual physiological rhythms (e.g., ballistocardiogram signatures) of each occupant, such as a first physiological rhythm 208a corresponding to the first subject 150a, and a second physiological rhythm 208b corresponding to the second subject 150b.</w:t>
+        <w:t>[0019] As shown in FIGS. 3 and 4, the buffered mixed signals from the sensors, such as mixed signals 401, 402, and 403, are passed to a signal separation engine 404 (corresponding to the signal separation module 105). The signal separation engine 404 executes a Blind Source Separation (BSS) algorithm. As illustrated by equations 306, the sensors 303, 304, 305 record a linear mixture of the latent sources, such as heartbeat A 301 and heartbeat B 302. The signal separation engine 404 mathematically decomposes the mixed multi-channel signals into a set of maximally independent latent source components. In a preferred embodiment, this generates a set of continuous, disentangled waveforms corresponding to the individual physiological rhythms, such as a recovered heartbeat A 405 corresponding to PERSON A, and a recovered heartbeat B 406 corresponding to PERSON B.</w:t>
       </w:r>
     </w:p>
     <w:p>
@@ -280,7 +280,7 @@
         <w:jc w:val="both"/>
       </w:pPr>
       <w:r>
-        <w:t>[0020] Referring to FIG. 6, because BSS algorithms inherently suffer from permutation ambiguity (the order of the output sources is random), the Occupant Attribution Engine 300 must resolve which latent source 206a, 206b corresponds to which physical occupant 150a, 150b. The Occupant Attribution Engine 300 calculates a first spatial fingerprint 302a for the first latent source 206a and a second spatial fingerprint 302b for the second latent source 206b by determining its cross-correlation with the raw, unfiltered signals originating from specific physical locations (e.g., Left Sensor 104a vs. Right Sensor 104b). By fusing spatial correlation, signal energy, and historical baseline metrics, the Occupant Attribution Engine 300 formulates a probabilistic assignment matrix 304. The difference between the highest and second-highest assignment probabilities is mapped to an Attribution Confidence Score 306.</w:t>
+        <w:t>[0020] Referring back to FIG. 1, because BSS algorithms inherently suffer from permutation ambiguity, an occupant identification module 108 must resolve which latent source corresponds to which physical occupant. The occupant identification module 108 calculates a spatial fingerprint for the recovered heartbeats 405, 406 by determining cross-correlations with the raw, unfiltered signals originating from specific physical locations (e.g., S1 201 vs. S3 203). By fusing spatial correlation and signal energy, the occupant identification module 108 formulates a probabilistic assignment matrix. A heartbeat detection module 106 and heart rate calculation module 107 then extract the final physiological metrics. The metrics are transmitted via a wireless communication module 109 to a user interface 110.</w:t>
       </w:r>
     </w:p>
     <w:p>
@@ -299,7 +299,7 @@
         <w:jc w:val="both"/>
       </w:pPr>
       <w:r>
-        <w:t>[0021] As illustrated in FIG. 7 and FIG. 8, continuous physiological monitoring is highly susceptible to momentary artifacts. The Identity Persistence Engine 400 prevents transient assignment errors from corrupting longitudinal sleep metrics. The Identity Persistence Engine 400 maintains a running memory of the active identity mapping 402 via a state machine 404. If the Occupant Attribution Engine 300 proposes a mapping that contradicts the active identity mapping 402 (e.g., suggesting first subject 150a is now on the second sensor 104b), the Identity Persistence Engine 400 evaluates the Attribution Confidence Score 306 against a pre-configured swap-threshold (e.g., 80% confidence). If the threshold is not met, the proposed swap is rejected as noise, and the active identity mapping 402 is persisted. If the threshold is exceeded, the swap is approved, accommodating legitimate physical crossover events without losing the continuous physiological thread of either subject 150a, 150b.</w:t>
+        <w:t>[0021] Continuous physiological monitoring is highly susceptible to momentary artifacts. To prevent transient assignment errors from corrupting longitudinal sleep metrics, the processing unit 104 maintains a running memory of the active identity mapping. If a mapping is proposed that contradicts the active identity mapping (e.g., suggesting PERSON A is now on the sensor 203), the system evaluates an attribution confidence score against a pre-configured swap-threshold. If the threshold is not met, the proposed swap is rejected as noise, and the active identity mapping is persisted. If the threshold is exceeded, the swap is approved, accommodating legitimate physical crossover events without losing the continuous physiological thread of either subject.</w:t>
       </w:r>
     </w:p>
     <w:p>

</xml_diff>

<commit_message>
Update document format to match Sri Lanka NIPO guidelines with a shorter title
</commit_message>
<xml_diff>
--- a/Professional_Patent_Draft_v2.docx
+++ b/Professional_Patent_Draft_v2.docx
@@ -4,20 +4,39 @@
   <w:body>
     <w:p>
       <w:pPr>
-        <w:pStyle w:val="Title"/>
+        <w:pStyle w:val="Heading1"/>
+        <w:spacing w:before="240" w:after="120"/>
         <w:jc w:val="center"/>
       </w:pPr>
       <w:r>
-        <w:t>SYSTEM, METHOD, AND COMPUTER-READABLE MEDIUM FOR LATENT SOURCE RECOVERY AND CONTINUOUS IDENTITY ATTRIBUTION IN MULTI-TARGET PHYSIOLOGICAL MONITORING</w:t>
+        <w:t>DESCRIPTION</w:t>
       </w:r>
     </w:p>
     <w:p>
       <w:pPr>
-        <w:pStyle w:val="Heading1"/>
+        <w:pStyle w:val="Heading2"/>
         <w:spacing w:before="240" w:after="120"/>
       </w:pPr>
       <w:r>
-        <w:t>FIELD OF THE INVENTION</w:t>
+        <w:t>Title of the invention</w:t>
+      </w:r>
+    </w:p>
+    <w:p>
+      <w:pPr>
+        <w:spacing w:line="480" w:lineRule="auto"/>
+        <w:jc w:val="both"/>
+      </w:pPr>
+      <w:r>
+        <w:t>MULTI-TARGET PHYSIOLOGICAL MONITORING SYSTEM</w:t>
+      </w:r>
+    </w:p>
+    <w:p>
+      <w:pPr>
+        <w:pStyle w:val="Heading2"/>
+        <w:spacing w:before="240" w:after="120"/>
+      </w:pPr>
+      <w:r>
+        <w:t>Technical Field</w:t>
       </w:r>
     </w:p>
     <w:p>
@@ -32,11 +51,11 @@
     </w:p>
     <w:p>
       <w:pPr>
-        <w:pStyle w:val="Heading1"/>
+        <w:pStyle w:val="Heading2"/>
         <w:spacing w:before="240" w:after="120"/>
       </w:pPr>
       <w:r>
-        <w:t>BACKGROUND OF THE INVENTION</w:t>
+        <w:t>Background art</w:t>
       </w:r>
     </w:p>
     <w:p>
@@ -51,12 +70,11 @@
     </w:p>
     <w:p>
       <w:pPr>
-        <w:spacing w:line="480" w:lineRule="auto"/>
-        <w:ind w:firstLine="720"/>
-        <w:jc w:val="both"/>
+        <w:pStyle w:val="Heading2"/>
+        <w:spacing w:before="240" w:after="120"/>
       </w:pPr>
       <w:r>
-        <w:t>[0003] Prior art systems attempt to resolve this cross-talk by relying on discrete movement events. For example, traditional methods determine which subject moved by comparing the signal amplitude of a sudden movement and measuring the time delay between the movement registering on a first sensor versus a second sensor. If the movement registers stronger and earlier on the left sensor, it is attributed to the left occupant. While functional for isolated movements, these methodologies fail dramatically during continuous periods of rest, simultaneous movement, or when occupants roll over into each other's respective sensor zones. Because traditional systems do not disentangle the continuous underlying physiological waveforms (i.e., the latent sources), they are highly susceptible to 'identity swapping'—where the system mistakenly assigns the heart rate of Subject A to Subject B following a complex physical shift.</w:t>
+        <w:t>Technical problem</w:t>
       </w:r>
     </w:p>
     <w:p>
@@ -66,16 +84,16 @@
         <w:jc w:val="both"/>
       </w:pPr>
       <w:r>
-        <w:t>[0004] Therefore, there exists a profound need in the art for a physiological monitoring system capable of blindly separating mixed physiological signals into continuous latent source streams, assigning those streams with probabilistic confidence, and persistently tracking identities to ensure high-fidelity longitudinal data.</w:t>
+        <w:t>[0003] Prior art systems attempt to resolve this cross-talk by relying on discrete movement events. For example, traditional methods determine which subject moved by comparing the signal amplitude of a sudden movement and measuring the time delay between the movement registering on a first sensor versus a second sensor. If the movement registers stronger and earlier on the left sensor, it is attributed to the left occupant. While functional for isolated movements, these methodologies fail dramatically during continuous periods of rest, simultaneous movement, or when occupants roll over into each other's respective sensor zones. Because traditional systems do not disentangle the continuous underlying physiological waveforms (i.e., the latent sources), they are highly susceptible to 'identity swapping'—where the system mistakenly assigns the heart rate of Subject A to Subject B following a complex physical shift. Therefore, there exists a profound need in the art for a physiological monitoring system capable of blindly separating mixed physiological signals into continuous latent source streams, assigning those streams with probabilistic confidence, and persistently tracking identities to ensure high-fidelity longitudinal data.</w:t>
       </w:r>
     </w:p>
     <w:p>
       <w:pPr>
-        <w:pStyle w:val="Heading1"/>
+        <w:pStyle w:val="Heading2"/>
         <w:spacing w:before="240" w:after="120"/>
       </w:pPr>
       <w:r>
-        <w:t>SUMMARY OF THE INVENTION</w:t>
+        <w:t>Technical Solution</w:t>
       </w:r>
     </w:p>
     <w:p>
@@ -85,7 +103,16 @@
         <w:jc w:val="both"/>
       </w:pPr>
       <w:r>
-        <w:t>[0005] The present invention satisfies the aforementioned need by disclosing a robust, three-engine signal processing architecture capable of isolating and continuously tracking physiological signatures from multiple occupants in a shared environment.</w:t>
+        <w:t>[0004] The present invention provides a robust, three-engine signal processing architecture capable of isolating and continuously tracking physiological signatures from multiple occupants in a shared environment. A Source Recovery Engine receives raw, mixed signal streams from a multi-channel sensor array and applies a Blind Source Separation (BSS) algorithm, such as Independent Component Analysis (ICA), across sliding time windows to mathematically reconstruct the latent, independent physiological waveforms of each occupant. An Occupant Attribution Engine analyzes the reconstructed latent waveforms to determine a spatial footprint, fusing this with respiration synchronization and signal variance metrics. The engine outputs an identity assignment accompanied by a calculated Attribution Confidence Score. An Identity Persistence Engine acts as a temporal state machine that enforces a hysteresis constraint wherein a proposed identity swap is rejected unless the Attribution Confidence Score strictly exceeds a predefined high-confidence threshold. This effectively eliminates erroneous identity swapping caused by transient noise or simultaneous movement.</w:t>
+      </w:r>
+    </w:p>
+    <w:p>
+      <w:pPr>
+        <w:pStyle w:val="Heading2"/>
+        <w:spacing w:before="240" w:after="120"/>
+      </w:pPr>
+      <w:r>
+        <w:t>Brief description of drawings</w:t>
       </w:r>
     </w:p>
     <w:p>
@@ -95,7 +122,7 @@
         <w:jc w:val="both"/>
       </w:pPr>
       <w:r>
-        <w:t>[0006] In one aspect of the present invention, a Source Recovery Engine receives raw, mixed signal streams from a multi-channel sensor array. Rather than searching for discrete amplitude thresholds indicative of movement, the Source Recovery Engine applies a Blind Source Separation (BSS) algorithm, such as Independent Component Analysis (ICA), across sliding time windows to mathematically reconstruct the latent, independent physiological waveforms of each occupant.</w:t>
+        <w:t>[0005] FIG. 1 illustrates an overview of the multi-target physiological monitoring system 100.</w:t>
       </w:r>
     </w:p>
     <w:p>
@@ -105,7 +132,7 @@
         <w:jc w:val="both"/>
       </w:pPr>
       <w:r>
-        <w:t>[0007] In another aspect, an Occupant Attribution Engine analyzes the reconstructed latent waveforms. It cross-correlates the separated sources with the original mixed signals to determine a spatial footprint, fusing this with respiration synchronization and signal variance metrics. The engine outputs an identity assignment accompanied by a calculated Attribution Confidence Score.</w:t>
+        <w:t>[0006] FIG. 2 shows a block diagram of the three-engine signal processing architecture.</w:t>
       </w:r>
     </w:p>
     <w:p>
@@ -115,16 +142,7 @@
         <w:jc w:val="both"/>
       </w:pPr>
       <w:r>
-        <w:t>[0008] In yet another aspect, an Identity Persistence Engine acts as a temporal state machine. It evaluates the current identity assignment against a historical identity mapping. The Identity Persistence Engine enforces a hysteresis constraint wherein a proposed identity swap (e.g., indicating the occupants have traded physical positions) is rejected unless the Attribution Confidence Score strictly exceeds a predefined high-confidence threshold. This effectively eliminates erroneous identity swapping caused by transient noise or simultaneous movement.</w:t>
-      </w:r>
-    </w:p>
-    <w:p>
-      <w:pPr>
-        <w:pStyle w:val="Heading1"/>
-        <w:spacing w:before="240" w:after="120"/>
-      </w:pPr>
-      <w:r>
-        <w:t>BRIEF DESCRIPTION OF THE DRAWINGS</w:t>
+        <w:t>[0007] FIG. 3 illustrates the operations within the Data Acquisition Layer 110.</w:t>
       </w:r>
     </w:p>
     <w:p>
@@ -134,7 +152,7 @@
         <w:jc w:val="both"/>
       </w:pPr>
       <w:r>
-        <w:t>[0009] FIG. 1 illustrates an overview of the multi-target physiological monitoring system 100.</w:t>
+        <w:t>[0008] FIG. 4 is a flow diagram detailing the Source Recovery Engine 200 operations.</w:t>
       </w:r>
     </w:p>
     <w:p>
@@ -144,7 +162,7 @@
         <w:jc w:val="both"/>
       </w:pPr>
       <w:r>
-        <w:t>[0010] FIG. 2 shows a block diagram of the three-engine signal processing architecture.</w:t>
+        <w:t>[0009] FIG. 5 illustrates the application of the Blind Source Separation algorithm 204.</w:t>
       </w:r>
     </w:p>
     <w:p>
@@ -154,7 +172,7 @@
         <w:jc w:val="both"/>
       </w:pPr>
       <w:r>
-        <w:t>[0011] FIG. 3 illustrates the operations within the Data Acquisition Layer 110.</w:t>
+        <w:t>[0010] FIG. 6 is a block diagram of the Occupant Attribution Engine 300 logic.</w:t>
       </w:r>
     </w:p>
     <w:p>
@@ -164,7 +182,7 @@
         <w:jc w:val="both"/>
       </w:pPr>
       <w:r>
-        <w:t>[0012] FIG. 4 is a flow diagram detailing the Source Recovery Engine 200 operations.</w:t>
+        <w:t>[0011] FIG. 7 illustrates the Identity Persistence Engine 400 state machine.</w:t>
       </w:r>
     </w:p>
     <w:p>
@@ -174,7 +192,16 @@
         <w:jc w:val="both"/>
       </w:pPr>
       <w:r>
-        <w:t>[0013] FIG. 5 illustrates the application of the Blind Source Separation algorithm 204.</w:t>
+        <w:t>[0012] FIG. 8 is a flowchart of a method for continuous physiological monitoring.</w:t>
+      </w:r>
+    </w:p>
+    <w:p>
+      <w:pPr>
+        <w:pStyle w:val="Heading2"/>
+        <w:spacing w:before="240" w:after="120"/>
+      </w:pPr>
+      <w:r>
+        <w:t>Advantageous effects</w:t>
       </w:r>
     </w:p>
     <w:p>
@@ -184,7 +211,16 @@
         <w:jc w:val="both"/>
       </w:pPr>
       <w:r>
-        <w:t>[0014] FIG. 6 is a block diagram of the Occupant Attribution Engine 300 logic.</w:t>
+        <w:t>[0013] The present invention provides highly accurate continuous physiological monitoring for multiple subjects without requiring wearable sensors. By recovering latent sources mathematically, it eliminates the false identity swaps common in prior art systems that rely merely on movement heuristics. The rigorous state-machine persistence ensures that longitudinal metrics such as sleep stages and resting heart rates are accurately attributed to the correct individual even during periods of heavy movement or close physical proximity.</w:t>
+      </w:r>
+    </w:p>
+    <w:p>
+      <w:pPr>
+        <w:pStyle w:val="Heading2"/>
+        <w:spacing w:before="240" w:after="120"/>
+      </w:pPr>
+      <w:r>
+        <w:t>Mode for invention</w:t>
       </w:r>
     </w:p>
     <w:p>
@@ -194,7 +230,7 @@
         <w:jc w:val="both"/>
       </w:pPr>
       <w:r>
-        <w:t>[0015] FIG. 7 illustrates the Identity Persistence Engine 400 state machine.</w:t>
+        <w:t>[0014] The following detailed description illustrates embodiments of the present disclosure. These embodiments are described in sufficient detail to enable those skilled in the art to practice the invention, and it is to be understood that other embodiments may be utilized and that logical, architectural, and algorithmic changes may be made without departing from the spirit or scope of the present invention. Reference is made to FIGS. 1-8 which illustrate various aspects of the invention.</w:t>
       </w:r>
     </w:p>
     <w:p>
@@ -204,16 +240,7 @@
         <w:jc w:val="both"/>
       </w:pPr>
       <w:r>
-        <w:t>[0016] FIG. 8 is a flowchart of a method for continuous physiological monitoring.</w:t>
-      </w:r>
-    </w:p>
-    <w:p>
-      <w:pPr>
-        <w:pStyle w:val="Heading1"/>
-        <w:spacing w:before="240" w:after="120"/>
-      </w:pPr>
-      <w:r>
-        <w:t>DETAILED DESCRIPTION OF THE INVENTION</w:t>
+        <w:t>[0015] Referring to FIG. 1 and FIG. 2, the multi-target physiological monitoring system 100 comprises a sensor array 101 configured for placement in proximity to the subjects, for example PERSON A and PERSON B. In a preferred embodiment, the sensor array 101 comprises at least a first sensor 201 (S1), a second sensor 202 (S2), and optionally a third sensor 203 (S3) disposed beneath a mattress. The signals from the sensor array 101 undergo analog signal conditioning 102. An analog-to-digital converter (ADC) 103 samples the signals at a high frequency. The raw data is continuously buffered and passed to a processing unit 104.</w:t>
       </w:r>
     </w:p>
     <w:p>
@@ -223,16 +250,7 @@
         <w:jc w:val="both"/>
       </w:pPr>
       <w:r>
-        <w:t>[0017] The following detailed description illustrates embodiments of the present disclosure. These embodiments are described in sufficient detail to enable those skilled in the art to practice the invention, and it is to be understood that other embodiments may be utilized and that logical, architectural, and algorithmic changes may be made without departing from the spirit or scope of the present invention. Reference is made to FIGS. 1-8 which illustrate various aspects of the invention.</w:t>
-      </w:r>
-    </w:p>
-    <w:p>
-      <w:pPr>
-        <w:pStyle w:val="Heading2"/>
-        <w:spacing w:before="240" w:after="120"/>
-      </w:pPr>
-      <w:r>
-        <w:t>The Data Acquisition Layer</w:t>
+        <w:t>[0016] As shown in FIGS. 3 and 4, the buffered mixed signals from the sensors, such as mixed signals 401, 402, and 403, are passed to a signal separation engine 404 (corresponding to the signal separation module 105). The signal separation engine 404 executes a Blind Source Separation (BSS) algorithm. As illustrated by equations 306, the sensors 303, 304, 305 record a linear mixture of the latent sources, such as heartbeat A 301 and heartbeat B 302. The signal separation engine 404 mathematically decomposes the mixed multi-channel signals into a set of maximally independent latent source components. In a preferred embodiment, this generates a set of continuous, disentangled waveforms corresponding to the individual physiological rhythms, such as a recovered heartbeat A 405 corresponding to PERSON A, and a recovered heartbeat B 406 corresponding to PERSON B.</w:t>
       </w:r>
     </w:p>
     <w:p>
@@ -242,16 +260,7 @@
         <w:jc w:val="both"/>
       </w:pPr>
       <w:r>
-        <w:t>[0018] Referring to FIG. 1 and FIG. 2, the multi-target physiological monitoring system 100 comprises a sensor array 101 configured for placement in proximity to the subjects, for example PERSON A and PERSON B. In a preferred embodiment, the sensor array 101 comprises at least a first sensor 201 (S1), a second sensor 202 (S2), and optionally a third sensor 203 (S3) disposed beneath a mattress. The signals from the sensor array 101 undergo analog signal conditioning 102. An analog-to-digital converter (ADC) 103 samples the signals at a high frequency. The raw data is continuously buffered and passed to a processing unit 104.</w:t>
-      </w:r>
-    </w:p>
-    <w:p>
-      <w:pPr>
-        <w:pStyle w:val="Heading2"/>
-        <w:spacing w:before="240" w:after="120"/>
-      </w:pPr>
-      <w:r>
-        <w:t>The Source Recovery Engine</w:t>
+        <w:t>[0017] Referring back to FIG. 1, because BSS algorithms inherently suffer from permutation ambiguity, an occupant identification module 108 must resolve which latent source corresponds to which physical occupant. The occupant identification module 108 calculates a spatial fingerprint for the recovered heartbeats 405, 406 by determining cross-correlations with the raw, unfiltered signals originating from specific physical locations (e.g., S1 201 vs. S3 203). By fusing spatial correlation and signal energy, the occupant identification module 108 formulates a probabilistic assignment matrix. A heartbeat detection module 106 and heart rate calculation module 107 then extract the final physiological metrics. The metrics are transmitted via a wireless communication module 109 to a user interface 110.</w:t>
       </w:r>
     </w:p>
     <w:p>
@@ -261,7 +270,7 @@
         <w:jc w:val="both"/>
       </w:pPr>
       <w:r>
-        <w:t>[0019] As shown in FIGS. 3 and 4, the buffered mixed signals from the sensors, such as mixed signals 401, 402, and 403, are passed to a signal separation engine 404 (corresponding to the signal separation module 105). The signal separation engine 404 executes a Blind Source Separation (BSS) algorithm. As illustrated by equations 306, the sensors 303, 304, 305 record a linear mixture of the latent sources, such as heartbeat A 301 and heartbeat B 302. The signal separation engine 404 mathematically decomposes the mixed multi-channel signals into a set of maximally independent latent source components. In a preferred embodiment, this generates a set of continuous, disentangled waveforms corresponding to the individual physiological rhythms, such as a recovered heartbeat A 405 corresponding to PERSON A, and a recovered heartbeat B 406 corresponding to PERSON B.</w:t>
+        <w:t>[0018] Continuous physiological monitoring is highly susceptible to momentary artifacts. To prevent transient assignment errors from corrupting longitudinal sleep metrics, the processing unit 104 maintains a running memory of the active identity mapping. If a mapping is proposed that contradicts the active identity mapping (e.g., suggesting PERSON A is now on the sensor 203), the system evaluates an attribution confidence score against a pre-configured swap-threshold. If the threshold is not met, the proposed swap is rejected as noise, and the active identity mapping is persisted. If the threshold is exceeded, the swap is approved, accommodating legitimate physical crossover events without losing the continuous physiological thread of either subject.</w:t>
       </w:r>
     </w:p>
     <w:p>
@@ -270,7 +279,7 @@
         <w:spacing w:before="240" w:after="120"/>
       </w:pPr>
       <w:r>
-        <w:t>The Occupant Attribution Engine</w:t>
+        <w:t>Industrial Applicability</w:t>
       </w:r>
     </w:p>
     <w:p>
@@ -280,26 +289,7 @@
         <w:jc w:val="both"/>
       </w:pPr>
       <w:r>
-        <w:t>[0020] Referring back to FIG. 1, because BSS algorithms inherently suffer from permutation ambiguity, an occupant identification module 108 must resolve which latent source corresponds to which physical occupant. The occupant identification module 108 calculates a spatial fingerprint for the recovered heartbeats 405, 406 by determining cross-correlations with the raw, unfiltered signals originating from specific physical locations (e.g., S1 201 vs. S3 203). By fusing spatial correlation and signal energy, the occupant identification module 108 formulates a probabilistic assignment matrix. A heartbeat detection module 106 and heart rate calculation module 107 then extract the final physiological metrics. The metrics are transmitted via a wireless communication module 109 to a user interface 110.</w:t>
-      </w:r>
-    </w:p>
-    <w:p>
-      <w:pPr>
-        <w:pStyle w:val="Heading2"/>
-        <w:spacing w:before="240" w:after="120"/>
-      </w:pPr>
-      <w:r>
-        <w:t>The Identity Persistence Engine</w:t>
-      </w:r>
-    </w:p>
-    <w:p>
-      <w:pPr>
-        <w:spacing w:line="480" w:lineRule="auto"/>
-        <w:ind w:firstLine="720"/>
-        <w:jc w:val="both"/>
-      </w:pPr>
-      <w:r>
-        <w:t>[0021] Continuous physiological monitoring is highly susceptible to momentary artifacts. To prevent transient assignment errors from corrupting longitudinal sleep metrics, the processing unit 104 maintains a running memory of the active identity mapping. If a mapping is proposed that contradicts the active identity mapping (e.g., suggesting PERSON A is now on the sensor 203), the system evaluates an attribution confidence score against a pre-configured swap-threshold. If the threshold is not met, the proposed swap is rejected as noise, and the active identity mapping is persisted. If the threshold is exceeded, the swap is approved, accommodating legitimate physical crossover events without losing the continuous physiological thread of either subject.</w:t>
+        <w:t>[0019] The invention is industrially applicable in the manufacturing of medical devices, consumer health monitoring products, and smart home appliances. It can be implemented as a commercial under-mattress sleep monitor, integrated directly into smart beds, or utilized in clinical settings for non-obtrusive patient monitoring.</w:t>
       </w:r>
     </w:p>
     <w:p>
@@ -313,7 +303,7 @@
         <w:spacing w:before="240" w:after="120"/>
       </w:pPr>
       <w:r>
-        <w:t>CLAIMS</w:t>
+        <w:t>Claims</w:t>
       </w:r>
     </w:p>
     <w:p>
@@ -449,7 +439,7 @@
         <w:jc w:val="center"/>
       </w:pPr>
       <w:r>
-        <w:t>ABSTRACT OF THE DISCLOSURE</w:t>
+        <w:t>Abstract</w:t>
       </w:r>
     </w:p>
     <w:p>

</xml_diff>

<commit_message>
Remove [0001] style paragraph numbering
</commit_message>
<xml_diff>
--- a/Professional_Patent_Draft_v2.docx
+++ b/Professional_Patent_Draft_v2.docx
@@ -46,7 +46,7 @@
         <w:jc w:val="both"/>
       </w:pPr>
       <w:r>
-        <w:t>[0001] The present invention relates generally to the field of non-invasive physiological monitoring. More specifically, the invention relates to signal processing architectures for multi-occupant environments, providing systems and methods for recovering, attributing, and maintaining the continuous identity of latent physiological signals extracted from mixed sensor arrays.</w:t>
+        <w:t>The present invention relates generally to the field of non-invasive physiological monitoring. More specifically, the invention relates to signal processing architectures for multi-occupant environments, providing systems and methods for recovering, attributing, and maintaining the continuous identity of latent physiological signals extracted from mixed sensor arrays.</w:t>
       </w:r>
     </w:p>
     <w:p>
@@ -65,7 +65,7 @@
         <w:jc w:val="both"/>
       </w:pPr>
       <w:r>
-        <w:t>[0002] Non-invasive physiological monitoring, particularly sleep monitoring using under-mattress sensors, has gained significant popularity. Such systems utilize force sensors, piezo-electric films, or strain gauges to detect ballistocardiographic (BCG) and respiratory efforts. However, when monitoring multiple subjects in close proximity (e.g., a double bed), the sensors inexorably capture a mixed signal containing overlapping physiological data and noise from both subjects.</w:t>
+        <w:t>Non-invasive physiological monitoring, particularly sleep monitoring using under-mattress sensors, has gained significant popularity. Such systems utilize force sensors, piezo-electric films, or strain gauges to detect ballistocardiographic (BCG) and respiratory efforts. However, when monitoring multiple subjects in close proximity (e.g., a double bed), the sensors inexorably capture a mixed signal containing overlapping physiological data and noise from both subjects.</w:t>
       </w:r>
     </w:p>
     <w:p>
@@ -84,7 +84,7 @@
         <w:jc w:val="both"/>
       </w:pPr>
       <w:r>
-        <w:t>[0003] Prior art systems attempt to resolve this cross-talk by relying on discrete movement events. For example, traditional methods determine which subject moved by comparing the signal amplitude of a sudden movement and measuring the time delay between the movement registering on a first sensor versus a second sensor. If the movement registers stronger and earlier on the left sensor, it is attributed to the left occupant. While functional for isolated movements, these methodologies fail dramatically during continuous periods of rest, simultaneous movement, or when occupants roll over into each other's respective sensor zones. Because traditional systems do not disentangle the continuous underlying physiological waveforms (i.e., the latent sources), they are highly susceptible to 'identity swapping'—where the system mistakenly assigns the heart rate of Subject A to Subject B following a complex physical shift. Therefore, there exists a profound need in the art for a physiological monitoring system capable of blindly separating mixed physiological signals into continuous latent source streams, assigning those streams with probabilistic confidence, and persistently tracking identities to ensure high-fidelity longitudinal data.</w:t>
+        <w:t>Prior art systems attempt to resolve this cross-talk by relying on discrete movement events. For example, traditional methods determine which subject moved by comparing the signal amplitude of a sudden movement and measuring the time delay between the movement registering on a first sensor versus a second sensor. If the movement registers stronger and earlier on the left sensor, it is attributed to the left occupant. While functional for isolated movements, these methodologies fail dramatically during continuous periods of rest, simultaneous movement, or when occupants roll over into each other's respective sensor zones. Because traditional systems do not disentangle the continuous underlying physiological waveforms (i.e., the latent sources), they are highly susceptible to 'identity swapping'—where the system mistakenly assigns the heart rate of Subject A to Subject B following a complex physical shift. Therefore, there exists a profound need in the art for a physiological monitoring system capable of blindly separating mixed physiological signals into continuous latent source streams, assigning those streams with probabilistic confidence, and persistently tracking identities to ensure high-fidelity longitudinal data.</w:t>
       </w:r>
     </w:p>
     <w:p>
@@ -103,7 +103,7 @@
         <w:jc w:val="both"/>
       </w:pPr>
       <w:r>
-        <w:t>[0004] The present invention provides a robust, three-engine signal processing architecture capable of isolating and continuously tracking physiological signatures from multiple occupants in a shared environment. A Source Recovery Engine receives raw, mixed signal streams from a multi-channel sensor array and applies a Blind Source Separation (BSS) algorithm, such as Independent Component Analysis (ICA), across sliding time windows to mathematically reconstruct the latent, independent physiological waveforms of each occupant. An Occupant Attribution Engine analyzes the reconstructed latent waveforms to determine a spatial footprint, fusing this with respiration synchronization and signal variance metrics. The engine outputs an identity assignment accompanied by a calculated Attribution Confidence Score. An Identity Persistence Engine acts as a temporal state machine that enforces a hysteresis constraint wherein a proposed identity swap is rejected unless the Attribution Confidence Score strictly exceeds a predefined high-confidence threshold. This effectively eliminates erroneous identity swapping caused by transient noise or simultaneous movement.</w:t>
+        <w:t>The present invention provides a robust, three-engine signal processing architecture capable of isolating and continuously tracking physiological signatures from multiple occupants in a shared environment. A Source Recovery Engine receives raw, mixed signal streams from a multi-channel sensor array and applies a Blind Source Separation (BSS) algorithm, such as Independent Component Analysis (ICA), across sliding time windows to mathematically reconstruct the latent, independent physiological waveforms of each occupant. An Occupant Attribution Engine analyzes the reconstructed latent waveforms to determine a spatial footprint, fusing this with respiration synchronization and signal variance metrics. The engine outputs an identity assignment accompanied by a calculated Attribution Confidence Score. An Identity Persistence Engine acts as a temporal state machine that enforces a hysteresis constraint wherein a proposed identity swap is rejected unless the Attribution Confidence Score strictly exceeds a predefined high-confidence threshold. This effectively eliminates erroneous identity swapping caused by transient noise or simultaneous movement.</w:t>
       </w:r>
     </w:p>
     <w:p>
@@ -122,7 +122,7 @@
         <w:jc w:val="both"/>
       </w:pPr>
       <w:r>
-        <w:t>[0005] FIG. 1 illustrates an overview of the multi-target physiological monitoring system 100.</w:t>
+        <w:t>FIG. 1 illustrates an overview of the multi-target physiological monitoring system 100.</w:t>
       </w:r>
     </w:p>
     <w:p>
@@ -132,7 +132,7 @@
         <w:jc w:val="both"/>
       </w:pPr>
       <w:r>
-        <w:t>[0006] FIG. 2 shows a block diagram of the three-engine signal processing architecture.</w:t>
+        <w:t>FIG. 2 shows a block diagram of the three-engine signal processing architecture.</w:t>
       </w:r>
     </w:p>
     <w:p>
@@ -142,7 +142,7 @@
         <w:jc w:val="both"/>
       </w:pPr>
       <w:r>
-        <w:t>[0007] FIG. 3 illustrates the operations within the Data Acquisition Layer 110.</w:t>
+        <w:t>FIG. 3 illustrates the operations within the Data Acquisition Layer 110.</w:t>
       </w:r>
     </w:p>
     <w:p>
@@ -152,7 +152,7 @@
         <w:jc w:val="both"/>
       </w:pPr>
       <w:r>
-        <w:t>[0008] FIG. 4 is a flow diagram detailing the Source Recovery Engine 200 operations.</w:t>
+        <w:t>FIG. 4 is a flow diagram detailing the Source Recovery Engine 200 operations.</w:t>
       </w:r>
     </w:p>
     <w:p>
@@ -162,7 +162,7 @@
         <w:jc w:val="both"/>
       </w:pPr>
       <w:r>
-        <w:t>[0009] FIG. 5 illustrates the application of the Blind Source Separation algorithm 204.</w:t>
+        <w:t>FIG. 5 illustrates the application of the Blind Source Separation algorithm 204.</w:t>
       </w:r>
     </w:p>
     <w:p>
@@ -172,7 +172,7 @@
         <w:jc w:val="both"/>
       </w:pPr>
       <w:r>
-        <w:t>[0010] FIG. 6 is a block diagram of the Occupant Attribution Engine 300 logic.</w:t>
+        <w:t>FIG. 6 is a block diagram of the Occupant Attribution Engine 300 logic.</w:t>
       </w:r>
     </w:p>
     <w:p>
@@ -182,7 +182,7 @@
         <w:jc w:val="both"/>
       </w:pPr>
       <w:r>
-        <w:t>[0011] FIG. 7 illustrates the Identity Persistence Engine 400 state machine.</w:t>
+        <w:t>FIG. 7 illustrates the Identity Persistence Engine 400 state machine.</w:t>
       </w:r>
     </w:p>
     <w:p>
@@ -192,7 +192,7 @@
         <w:jc w:val="both"/>
       </w:pPr>
       <w:r>
-        <w:t>[0012] FIG. 8 is a flowchart of a method for continuous physiological monitoring.</w:t>
+        <w:t>FIG. 8 is a flowchart of a method for continuous physiological monitoring.</w:t>
       </w:r>
     </w:p>
     <w:p>
@@ -211,7 +211,7 @@
         <w:jc w:val="both"/>
       </w:pPr>
       <w:r>
-        <w:t>[0013] The present invention provides highly accurate continuous physiological monitoring for multiple subjects without requiring wearable sensors. By recovering latent sources mathematically, it eliminates the false identity swaps common in prior art systems that rely merely on movement heuristics. The rigorous state-machine persistence ensures that longitudinal metrics such as sleep stages and resting heart rates are accurately attributed to the correct individual even during periods of heavy movement or close physical proximity.</w:t>
+        <w:t>The present invention provides highly accurate continuous physiological monitoring for multiple subjects without requiring wearable sensors. By recovering latent sources mathematically, it eliminates the false identity swaps common in prior art systems that rely merely on movement heuristics. The rigorous state-machine persistence ensures that longitudinal metrics such as sleep stages and resting heart rates are accurately attributed to the correct individual even during periods of heavy movement or close physical proximity.</w:t>
       </w:r>
     </w:p>
     <w:p>
@@ -230,7 +230,7 @@
         <w:jc w:val="both"/>
       </w:pPr>
       <w:r>
-        <w:t>[0014] The following detailed description illustrates embodiments of the present disclosure. These embodiments are described in sufficient detail to enable those skilled in the art to practice the invention, and it is to be understood that other embodiments may be utilized and that logical, architectural, and algorithmic changes may be made without departing from the spirit or scope of the present invention. Reference is made to FIGS. 1-8 which illustrate various aspects of the invention.</w:t>
+        <w:t>The following detailed description illustrates embodiments of the present disclosure. These embodiments are described in sufficient detail to enable those skilled in the art to practice the invention, and it is to be understood that other embodiments may be utilized and that logical, architectural, and algorithmic changes may be made without departing from the spirit or scope of the present invention. Reference is made to FIGS. 1-8 which illustrate various aspects of the invention.</w:t>
       </w:r>
     </w:p>
     <w:p>
@@ -240,7 +240,7 @@
         <w:jc w:val="both"/>
       </w:pPr>
       <w:r>
-        <w:t>[0015] Referring to FIG. 1 and FIG. 2, the multi-target physiological monitoring system 100 comprises a sensor array 101 configured for placement in proximity to the subjects, for example PERSON A and PERSON B. In a preferred embodiment, the sensor array 101 comprises at least a first sensor 201 (S1), a second sensor 202 (S2), and optionally a third sensor 203 (S3) disposed beneath a mattress. The signals from the sensor array 101 undergo analog signal conditioning 102. An analog-to-digital converter (ADC) 103 samples the signals at a high frequency. The raw data is continuously buffered and passed to a processing unit 104.</w:t>
+        <w:t>Referring to FIG. 1 and FIG. 2, the multi-target physiological monitoring system 100 comprises a sensor array 101 configured for placement in proximity to the subjects, for example PERSON A and PERSON B. In a preferred embodiment, the sensor array 101 comprises at least a first sensor 201 (S1), a second sensor 202 (S2), and optionally a third sensor 203 (S3) disposed beneath a mattress. The signals from the sensor array 101 undergo analog signal conditioning 102. An analog-to-digital converter (ADC) 103 samples the signals at a high frequency. The raw data is continuously buffered and passed to a processing unit 104.</w:t>
       </w:r>
     </w:p>
     <w:p>
@@ -250,7 +250,7 @@
         <w:jc w:val="both"/>
       </w:pPr>
       <w:r>
-        <w:t>[0016] As shown in FIGS. 3 and 4, the buffered mixed signals from the sensors, such as mixed signals 401, 402, and 403, are passed to a signal separation engine 404 (corresponding to the signal separation module 105). The signal separation engine 404 executes a Blind Source Separation (BSS) algorithm. As illustrated by equations 306, the sensors 303, 304, 305 record a linear mixture of the latent sources, such as heartbeat A 301 and heartbeat B 302. The signal separation engine 404 mathematically decomposes the mixed multi-channel signals into a set of maximally independent latent source components. In a preferred embodiment, this generates a set of continuous, disentangled waveforms corresponding to the individual physiological rhythms, such as a recovered heartbeat A 405 corresponding to PERSON A, and a recovered heartbeat B 406 corresponding to PERSON B.</w:t>
+        <w:t>As shown in FIGS. 3 and 4, the buffered mixed signals from the sensors, such as mixed signals 401, 402, and 403, are passed to a signal separation engine 404 (corresponding to the signal separation module 105). The signal separation engine 404 executes a Blind Source Separation (BSS) algorithm. As illustrated by equations 306, the sensors 303, 304, 305 record a linear mixture of the latent sources, such as heartbeat A 301 and heartbeat B 302. The signal separation engine 404 mathematically decomposes the mixed multi-channel signals into a set of maximally independent latent source components. In a preferred embodiment, this generates a set of continuous, disentangled waveforms corresponding to the individual physiological rhythms, such as a recovered heartbeat A 405 corresponding to PERSON A, and a recovered heartbeat B 406 corresponding to PERSON B.</w:t>
       </w:r>
     </w:p>
     <w:p>
@@ -260,7 +260,7 @@
         <w:jc w:val="both"/>
       </w:pPr>
       <w:r>
-        <w:t>[0017] Referring back to FIG. 1, because BSS algorithms inherently suffer from permutation ambiguity, an occupant identification module 108 must resolve which latent source corresponds to which physical occupant. The occupant identification module 108 calculates a spatial fingerprint for the recovered heartbeats 405, 406 by determining cross-correlations with the raw, unfiltered signals originating from specific physical locations (e.g., S1 201 vs. S3 203). By fusing spatial correlation and signal energy, the occupant identification module 108 formulates a probabilistic assignment matrix. A heartbeat detection module 106 and heart rate calculation module 107 then extract the final physiological metrics. The metrics are transmitted via a wireless communication module 109 to a user interface 110.</w:t>
+        <w:t>Referring back to FIG. 1, because BSS algorithms inherently suffer from permutation ambiguity, an occupant identification module 108 must resolve which latent source corresponds to which physical occupant. The occupant identification module 108 calculates a spatial fingerprint for the recovered heartbeats 405, 406 by determining cross-correlations with the raw, unfiltered signals originating from specific physical locations (e.g., S1 201 vs. S3 203). By fusing spatial correlation and signal energy, the occupant identification module 108 formulates a probabilistic assignment matrix. A heartbeat detection module 106 and heart rate calculation module 107 then extract the final physiological metrics. The metrics are transmitted via a wireless communication module 109 to a user interface 110.</w:t>
       </w:r>
     </w:p>
     <w:p>
@@ -270,7 +270,7 @@
         <w:jc w:val="both"/>
       </w:pPr>
       <w:r>
-        <w:t>[0018] Continuous physiological monitoring is highly susceptible to momentary artifacts. To prevent transient assignment errors from corrupting longitudinal sleep metrics, the processing unit 104 maintains a running memory of the active identity mapping. If a mapping is proposed that contradicts the active identity mapping (e.g., suggesting PERSON A is now on the sensor 203), the system evaluates an attribution confidence score against a pre-configured swap-threshold. If the threshold is not met, the proposed swap is rejected as noise, and the active identity mapping is persisted. If the threshold is exceeded, the swap is approved, accommodating legitimate physical crossover events without losing the continuous physiological thread of either subject.</w:t>
+        <w:t>Continuous physiological monitoring is highly susceptible to momentary artifacts. To prevent transient assignment errors from corrupting longitudinal sleep metrics, the processing unit 104 maintains a running memory of the active identity mapping. If a mapping is proposed that contradicts the active identity mapping (e.g., suggesting PERSON A is now on the sensor 203), the system evaluates an attribution confidence score against a pre-configured swap-threshold. If the threshold is not met, the proposed swap is rejected as noise, and the active identity mapping is persisted. If the threshold is exceeded, the swap is approved, accommodating legitimate physical crossover events without losing the continuous physiological thread of either subject.</w:t>
       </w:r>
     </w:p>
     <w:p>
@@ -289,7 +289,7 @@
         <w:jc w:val="both"/>
       </w:pPr>
       <w:r>
-        <w:t>[0019] The invention is industrially applicable in the manufacturing of medical devices, consumer health monitoring products, and smart home appliances. It can be implemented as a commercial under-mattress sleep monitor, integrated directly into smart beds, or utilized in clinical settings for non-obtrusive patient monitoring.</w:t>
+        <w:t>The invention is industrially applicable in the manufacturing of medical devices, consumer health monitoring products, and smart home appliances. It can be implemented as a commercial under-mattress sleep monitor, integrated directly into smart beds, or utilized in clinical settings for non-obtrusive patient monitoring.</w:t>
       </w:r>
     </w:p>
     <w:p>
@@ -449,7 +449,7 @@
         <w:jc w:val="both"/>
       </w:pPr>
       <w:r>
-        <w:t>[0000] A system and method for continuous, multi-target physiological monitoring that separates and persistently tracks signals from multiple subjects sharing a monitored environment. The system comprises a sensor array to capture a plurality of mixed physiological signals. A Source Recovery Engine actively reconstructs continuous latent physiological streams from the mixed signals using blind source separation techniques, bypassing reliance on discrete movement events. An Occupant Attribution Engine assigns the recovered streams to respective subjects based on a multi-dimensional spatial and temporal confidence score. An Identity Persistence Engine maintains longitudinal identity associations using a state machine that overrides existing identity mappings only if an attribution confidence metric surpasses a predefined high-confidence threshold. The invention prevents identity swapping during simultaneous movement or sensor zone crossover.</w:t>
+        <w:t>A system and method for continuous, multi-target physiological monitoring that separates and persistently tracks signals from multiple subjects sharing a monitored environment. The system comprises a sensor array to capture a plurality of mixed physiological signals. A Source Recovery Engine actively reconstructs continuous latent physiological streams from the mixed signals using blind source separation techniques, bypassing reliance on discrete movement events. An Occupant Attribution Engine assigns the recovered streams to respective subjects based on a multi-dimensional spatial and temporal confidence score. An Identity Persistence Engine maintains longitudinal identity associations using a state machine that overrides existing identity mappings only if an attribution confidence metric surpasses a predefined high-confidence threshold. The invention prevents identity swapping during simultaneous movement or sensor zone crossover.</w:t>
       </w:r>
     </w:p>
     <w:p>

</xml_diff>